<commit_message>
docs(rgpd): export PDF + AIPD paiement + correction hébergement (Irlande)
- générateur unifié scripts/gen-rgpd-all.py : chaque document en .docx ET .pdf
  depuis un modèle de contenu commun (remplace les 2 anciens scripts)
- nouvelle AIPD dédiée au volet paiement/rémunération (IBAN, wallet, Stripe)
- /rgpd : correction hébergement Supabase « Francfort » -> « Irlande (eu-west-1) »
  conforme au projet de prod ; date de mise à jour 14/06/2026
- 5 documents (synthèse sécurité, registre, référentiel, 2 AIPD) en docx + pdf

Co-Authored-By: Claude Opus 4.8 (1M context) <noreply@anthropic.com>
</commit_message>
<xml_diff>
--- a/docs/rgpd/AIPD-BUUPP-mise-en-relation-scoring.docx
+++ b/docs/rgpd/AIPD-BUUPP-mise-en-relation-scoring.docx
@@ -21,7 +21,6 @@
       </w:pPr>
       <w:r>
         <w:rPr>
-          <w:color w:val="0F172A"/>
           <w:sz w:val="32"/>
         </w:rPr>
         <w:t>Analyse d'impact relative à la protection des données (AIPD)</w:t>
@@ -37,7 +36,7 @@
           <w:color w:val="475565"/>
           <w:sz w:val="22"/>
         </w:rPr>
-        <w:t>Traitement : Mise en relation rémunérée avec scoring et segmentation — art. 35 RGPD</w:t>
+        <w:t>Traitement : mise en relation rémunérée avec scoring et segmentation — art. 35 RGPD</w:t>
       </w:r>
     </w:p>
     <w:p/>
@@ -63,18 +62,14 @@
         <w:t>Version : 14/06/2026</w:t>
       </w:r>
     </w:p>
-    <w:p/>
     <w:p>
-      <w:pPr>
-        <w:spacing w:after="200"/>
-      </w:pPr>
       <w:r>
         <w:rPr>
           <w:i/>
           <w:color w:val="B45309"/>
           <w:sz w:val="17"/>
         </w:rPr>
-        <w:t>Document de travail ancré sur le système en production (politique de confidentialité publiée, base de données, code source). Les arbitrages juridiques (bases légales, durées, désignation du DPO) doivent être validés par le DPO / le conseil juridique. Les champs marqués « [À COMPLÉTER] » requièrent une décision du responsable de traitement.</w:t>
+        <w:t>Document de travail ancré sur le système en production (politique de confidentialité publiée, base de données, code source). Les arbitrages juridiques (bases légales, durées, désignation du DPO) doivent être validés par le DPO / le conseil juridique. Les champs marqués « [À COMPLÉTER] » requièrent une décision du responsable de traitement. Ce document ne constitue pas un avis juridique.</w:t>
       </w:r>
     </w:p>
     <w:p>
@@ -94,15 +89,12 @@
       </w:r>
     </w:p>
     <w:p>
-      <w:pPr>
-        <w:spacing w:after="120"/>
-      </w:pPr>
       <w:r>
         <w:rPr>
           <w:b w:val="0"/>
           <w:i w:val="0"/>
         </w:rPr>
-        <w:t>Une AIPD est requise lorsqu'un traitement est susceptible d'engendrer un risque élevé. Le traitement central de BUUPP remplit plusieurs des 9 critères du CEPD (WP248) — au moins deux suffisent à présumer le risque élevé :</w:t>
+        <w:t>Une AIPD est requise en cas de risque élevé probable. Le traitement central de BUUPP remplit plusieurs des 9 critères du CEPD (WP248) — deux suffisent :</w:t>
       </w:r>
     </w:p>
     <w:p>
@@ -116,7 +108,7 @@
         <w:t xml:space="preserve">✔ </w:t>
       </w:r>
       <w:r>
-        <w:t>Évaluation / scoring : calcul du BUUPP Score (qualité de profil).</w:t>
+        <w:t>Évaluation / scoring : calcul du BUUPP Score.</w:t>
       </w:r>
     </w:p>
     <w:p>
@@ -130,7 +122,7 @@
         <w:t xml:space="preserve">✔ </w:t>
       </w:r>
       <w:r>
-        <w:t>Croisement / combinaison de données : segmentation multi-facettes (revenus, patrimoine, localisation, foyer, etc.).</w:t>
+        <w:t>Croisement de données : segmentation multi-facettes (revenus, patrimoine, localisation, foyer…).</w:t>
       </w:r>
     </w:p>
     <w:p>
@@ -144,7 +136,7 @@
         <w:t xml:space="preserve">✔ </w:t>
       </w:r>
       <w:r>
-        <w:t>Données à caractère hautement personnel : revenus, patrimoine, projets de vie, coordonnées bancaires (IBAN).</w:t>
+        <w:t>Données hautement personnelles : revenus, patrimoine, projets, IBAN.</w:t>
       </w:r>
     </w:p>
     <w:p>
@@ -158,7 +150,7 @@
         <w:t xml:space="preserve">✔ </w:t>
       </w:r>
       <w:r>
-        <w:t>Usage innovant : modèle de rémunération de la donnée personnelle à double consentement (nouveauté).</w:t>
+        <w:t>Usage innovant : rémunération de la donnée à double consentement.</w:t>
       </w:r>
     </w:p>
     <w:p>
@@ -176,15 +168,12 @@
       </w:r>
     </w:p>
     <w:p>
-      <w:pPr>
-        <w:spacing w:after="120"/>
-      </w:pPr>
       <w:r>
         <w:rPr>
           <w:b w:val="0"/>
           <w:i w:val="0"/>
         </w:rPr>
-        <w:t>Conclusion : AIPD requise pour ce traitement. Les traitements purement comptables/fiscaux (T7) et de paiement (T6, largement délégué à Stripe) présentent un risque résiduel plus faible mais alimentent ce traitement central ; ils sont couverts par la présente analyse. Les autres traitements (compte, communication, waitlist) ne nécessitent pas d'AIPD distincte mais sont documentés au registre.</w:t>
+        <w:t>Conclusion : AIPD requise. Le volet paiement fait l'objet d'une AIPD dédiée.</w:t>
       </w:r>
     </w:p>
     <w:p>
@@ -209,7 +198,7 @@
         <w:t xml:space="preserve">Finalités : </w:t>
       </w:r>
       <w:r>
-        <w:t>Mettre en relation des prospects consentants avec des professionnels, en valorisant et segmentant les profils, tout en rémunérant le prospect.</w:t>
+        <w:t>mettre en relation des prospects consentants et des professionnels, en valorisant/segmentant les profils, avec rémunération du prospect.</w:t>
       </w:r>
     </w:p>
     <w:p>
@@ -223,7 +212,7 @@
         <w:t xml:space="preserve">Données : </w:t>
       </w:r>
       <w:r>
-        <w:t>Identité (palier 1), profil enrichi (paliers 2-5 dont revenus/patrimoine), score dérivé, données de relation, coordonnées bancaires (rémunération).</w:t>
+        <w:t>identité (palier 1), profil enrichi (paliers 2-5 dont revenus/patrimoine), score dérivé, données de relation.</w:t>
       </w:r>
     </w:p>
     <w:p>
@@ -237,7 +226,7 @@
         <w:t xml:space="preserve">Acteurs : </w:t>
       </w:r>
       <w:r>
-        <w:t>Prospects (personnes concernées), professionnels (utilisateurs), personnels Majelink, sous-traitants (cf. registre).</w:t>
+        <w:t>prospects (personnes concernées), professionnels, personnels Majelink, sous-traitants (cf. registre).</w:t>
       </w:r>
     </w:p>
     <w:p>
@@ -251,7 +240,7 @@
         <w:t xml:space="preserve">Cycle de vie : </w:t>
       </w:r>
       <w:r>
-        <w:t>Collecte (inscription, consentement par palier) → scoring/segmentation → sollicitation (double consentement) → pseudonymisation → révélation journalisée → rémunération → archivage/suppression selon le référentiel.</w:t>
+        <w:t>collecte (consentement par palier) → scoring/segmentation → sollicitation (double consentement) → pseudonymisation → révélation journalisée → rémunération → archivage/suppression.</w:t>
       </w:r>
     </w:p>
     <w:p>
@@ -265,7 +254,7 @@
         <w:t xml:space="preserve">Mesures existantes : </w:t>
       </w:r>
       <w:r>
-        <w:t>Hébergement UE ; chiffrement ; RLS ; pseudonymisation à la lecture ; alias e-mail watermarqués ; journal des accès fail-closed + append-only ; anti-fraude.</w:t>
+        <w:t>hébergement UE, chiffrement, RLS, pseudonymisation à la lecture, alias watermarqués, journal fail-closed + append-only, anti-fraude.</w:t>
       </w:r>
     </w:p>
     <w:p>
@@ -290,7 +279,7 @@
         <w:t xml:space="preserve">Base légale : </w:t>
       </w:r>
       <w:r>
-        <w:t>Exécution du contrat (mise en relation, paiement) ; consentement (paliers facultatifs, sollicitations) ; obligation légale (fiscal) ; intérêt légitime (fraude, sécurité). Légitimité à confirmer par la balance d'intérêts pour le scoring. [À COMPLÉTER]</w:t>
+        <w:t>contrat (mise en relation) ; consentement (paliers, sollicitations) ; obligation légale (fiscal) ; intérêt légitime (fraude). Balance d'intérêts du scoring à formaliser. [À COMPLÉTER]</w:t>
       </w:r>
     </w:p>
     <w:p>
@@ -304,7 +293,7 @@
         <w:t xml:space="preserve">Minimisation : </w:t>
       </w:r>
       <w:r>
-        <w:t>Minimisation par finalité (seuls les paliers nécessaires à l'objectif du pro sont autorisés et facturés) ; paliers 2-5 facultatifs et révocables.</w:t>
+        <w:t>seuls les paliers nécessaires à l'objectif du pro sont autorisés/facturés ; paliers 2-5 facultatifs et révocables.</w:t>
       </w:r>
     </w:p>
     <w:p>
@@ -315,10 +304,10 @@
         <w:rPr>
           <w:b/>
         </w:rPr>
-        <w:t xml:space="preserve">Qualité / exactitude : </w:t>
+        <w:t xml:space="preserve">Qualité : </w:t>
       </w:r>
       <w:r>
-        <w:t>Données saisies par le prospect lui-même ; téléphone vérifié par OTP ; unicité anti-doublon.</w:t>
+        <w:t>données saisies par le prospect ; téléphone vérifié OTP ; unicité anti-doublon.</w:t>
       </w:r>
     </w:p>
     <w:p>
@@ -332,7 +321,7 @@
         <w:t xml:space="preserve">Durées : </w:t>
       </w:r>
       <w:r>
-        <w:t>Conformes au référentiel de conservation (document dédié).</w:t>
+        <w:t>conformes au référentiel de conservation.</w:t>
       </w:r>
     </w:p>
     <w:p>
@@ -346,7 +335,7 @@
         <w:t xml:space="preserve">Information &amp; droits : </w:t>
       </w:r>
       <w:r>
-        <w:t>Information via la politique de confidentialité, la page DPO et la page minimisation ; double consentement explicite ; droits d'accès, rectification, effacement, opposition, portabilité exerçables.</w:t>
+        <w:t>politique de confidentialité, page DPO, page minimisation ; double consentement ; droits d'accès, rectification, effacement, opposition, portabilité.</w:t>
       </w:r>
     </w:p>
     <w:p>
@@ -361,16 +350,13 @@
       </w:r>
     </w:p>
     <w:p>
-      <w:pPr>
-        <w:spacing w:after="120"/>
-      </w:pPr>
       <w:r>
         <w:rPr>
           <w:b w:val="0"/>
           <w:i/>
           <w:sz w:val="18"/>
         </w:rPr>
-        <w:t>Trois événements redoutés (méthode CNIL) : accès illégitime, modification non désirée, disparition de données. Gravité et vraisemblance évaluées AVANT/APRÈS mesures. (Cotation à valider en atelier DPO — échelle : Négligeable / Limitée / Importante / Maximale.)</w:t>
+        <w:t>Trois événements redoutés (méthode CNIL) : accès illégitime, modification non désirée, disparition. Cotation gravité × vraisemblance à valider en atelier DPO.</w:t>
       </w:r>
     </w:p>
     <w:tbl>
@@ -454,7 +440,7 @@
               <w:rPr>
                 <w:sz w:val="16"/>
               </w:rPr>
-              <w:t>Accès illégitime aux données (ré-identification d'un profil, fuite d'IBAN/revenus)</w:t>
+              <w:t>Accès illégitime (ré-identification, fuite IBAN/revenus)</w:t>
             </w:r>
           </w:p>
         </w:tc>
@@ -467,7 +453,7 @@
               <w:rPr>
                 <w:sz w:val="16"/>
               </w:rPr>
-              <w:t>Atteinte à la vie privée, démarchage abusif, risque financier</w:t>
+              <w:t>Atteinte vie privée, démarchage abusif, risque financier</w:t>
             </w:r>
           </w:p>
         </w:tc>
@@ -480,7 +466,7 @@
               <w:rPr>
                 <w:sz w:val="16"/>
               </w:rPr>
-              <w:t>Pseudonymisation à la lecture ; alias watermarqués ; RLS ; chiffrement ; révélation gated + journalisée ; aucune donnée carte stockée</w:t>
+              <w:t>Pseudonymisation à la lecture ; alias watermarqués ; RLS ; chiffrement ; révélation gated + journalisée ; aucune carte stockée</w:t>
             </w:r>
           </w:p>
         </w:tc>
@@ -534,7 +520,7 @@
               <w:rPr>
                 <w:sz w:val="16"/>
               </w:rPr>
-              <w:t>Données pseudonymisées non exportables ; consentement à usage unique ; watermark traçable ; journal des accès inviolable ; alerte abus</w:t>
+              <w:t>Données non exportables ; consentement à usage unique ; watermark traçable ; journal inviolable ; alerte abus</w:t>
             </w:r>
           </w:p>
         </w:tc>
@@ -562,7 +548,7 @@
               <w:rPr>
                 <w:sz w:val="16"/>
               </w:rPr>
-              <w:t>Modification / falsification d'une trace d'accès</w:t>
+              <w:t>Falsification d'une trace d'accès</w:t>
             </w:r>
           </w:p>
         </w:tc>
@@ -575,7 +561,7 @@
               <w:rPr>
                 <w:sz w:val="16"/>
               </w:rPr>
-              <w:t>Impossibilité de prouver qui a accédé aux données</w:t>
+              <w:t>Impossibilité de prouver l'accès</w:t>
             </w:r>
           </w:p>
         </w:tc>
@@ -616,7 +602,7 @@
               <w:rPr>
                 <w:sz w:val="16"/>
               </w:rPr>
-              <w:t>Profilage abusif (scoring) ou décision défavorable</w:t>
+              <w:t>Profilage abusif (scoring) / décision défavorable</w:t>
             </w:r>
           </w:p>
         </w:tc>
@@ -642,7 +628,7 @@
               <w:rPr>
                 <w:sz w:val="16"/>
               </w:rPr>
-              <w:t>Score non décisionnel automatisé à effet juridique ; transparence ; pas de catégorie sensible ; droits d'opposition/rectification</w:t>
+              <w:t>Score non décisionnel à effet juridique ; transparence ; pas de catégorie sensible ; opposition/rectification</w:t>
             </w:r>
           </w:p>
         </w:tc>
@@ -670,7 +656,7 @@
               <w:rPr>
                 <w:sz w:val="16"/>
               </w:rPr>
-              <w:t>Disparition / indisponibilité des données</w:t>
+              <w:t>Disparition / indisponibilité</w:t>
             </w:r>
           </w:p>
         </w:tc>
@@ -696,7 +682,7 @@
               <w:rPr>
                 <w:sz w:val="16"/>
               </w:rPr>
-              <w:t>Hébergement managé (sauvegardes Supabase) ; séquestre des fonds</w:t>
+              <w:t>Hébergement managé (sauvegardes) ; séquestre des fonds</w:t>
             </w:r>
           </w:p>
         </w:tc>
@@ -716,9 +702,6 @@
       </w:tr>
     </w:tbl>
     <w:p>
-      <w:pPr>
-        <w:spacing w:after="120"/>
-      </w:pPr>
       <w:r>
         <w:rPr>
           <w:b w:val="0"/>
@@ -726,7 +709,7 @@
           <w:color w:val="B45309"/>
           <w:sz w:val="17"/>
         </w:rPr>
-        <w:t>* La cotation finale (gravité × vraisemblance) doit être arrêtée en atelier avec le DPO et tracée dans l'outil PIA de la CNIL. [À COMPLÉTER]</w:t>
+        <w:t>* Cotation finale à arrêter avec le DPO (outil PIA CNIL). [À COMPLÉTER]</w:t>
       </w:r>
     </w:p>
     <w:p>
@@ -745,7 +728,7 @@
         <w:pStyle w:val="ListBullet"/>
       </w:pPr>
       <w:r>
-        <w:t>Formaliser la balance d'intérêts pour le scoring (intérêt légitime).</w:t>
+        <w:t>Formaliser la balance d'intérêts du scoring (intérêt légitime).</w:t>
       </w:r>
     </w:p>
     <w:p>
@@ -761,7 +744,7 @@
         <w:pStyle w:val="ListBullet"/>
       </w:pPr>
       <w:r>
-        <w:t>Tenir à jour les DPA des sous-traitants ; harmoniser la région d'hébergement annoncée (Irlande) avec la politique publiée.</w:t>
+        <w:t>Tenir à jour les DPA des sous-traitants.</w:t>
       </w:r>
     </w:p>
     <w:p>
@@ -769,26 +752,7 @@
         <w:pStyle w:val="ListBullet"/>
       </w:pPr>
       <w:r>
-        <w:t>Réaliser/valider la cotation des risques dans l'outil PIA CNIL avec le DPO.</w:t>
-      </w:r>
-    </w:p>
-    <w:p>
-      <w:pPr>
-        <w:pStyle w:val="ListBullet"/>
-      </w:pPr>
-      <w:r>
-        <w:t>Avis du DPO et validation par le responsable de traitement à consigner ci-dessous.</w:t>
-      </w:r>
-    </w:p>
-    <w:p>
-      <w:pPr>
-        <w:spacing w:after="120"/>
-      </w:pPr>
-      <w:r>
-        <w:rPr>
-          <w:b w:val="0"/>
-          <w:i w:val="0"/>
-        </w:rPr>
+        <w:t>Valider la cotation des risques (outil PIA CNIL) avec le DPO.</w:t>
       </w:r>
     </w:p>
     <w:tbl>
@@ -813,7 +777,7 @@
             <w:r>
               <w:rPr>
                 <w:b/>
-                <w:sz w:val="18"/>
+                <w:sz w:val="16"/>
               </w:rPr>
               <w:t>Rôle</w:t>
             </w:r>
@@ -827,7 +791,7 @@
             <w:r>
               <w:rPr>
                 <w:b/>
-                <w:sz w:val="18"/>
+                <w:sz w:val="16"/>
               </w:rPr>
               <w:t>Nom</w:t>
             </w:r>
@@ -841,7 +805,7 @@
             <w:r>
               <w:rPr>
                 <w:b/>
-                <w:sz w:val="18"/>
+                <w:sz w:val="16"/>
               </w:rPr>
               <w:t>Avis / décision</w:t>
             </w:r>
@@ -855,7 +819,7 @@
             <w:r>
               <w:rPr>
                 <w:b/>
-                <w:sz w:val="18"/>
+                <w:sz w:val="16"/>
               </w:rPr>
               <w:t>Date</w:t>
             </w:r>
@@ -870,7 +834,7 @@
           <w:p>
             <w:r>
               <w:rPr>
-                <w:sz w:val="18"/>
+                <w:sz w:val="16"/>
               </w:rPr>
               <w:t>Responsable de traitement</w:t>
             </w:r>
@@ -883,7 +847,7 @@
           <w:p>
             <w:r>
               <w:rPr>
-                <w:sz w:val="18"/>
+                <w:sz w:val="16"/>
               </w:rPr>
               <w:t>[À COMPLÉTER]</w:t>
             </w:r>
@@ -896,7 +860,7 @@
           <w:p>
             <w:r>
               <w:rPr>
-                <w:sz w:val="18"/>
+                <w:sz w:val="16"/>
               </w:rPr>
             </w:r>
           </w:p>
@@ -908,7 +872,7 @@
           <w:p>
             <w:r>
               <w:rPr>
-                <w:sz w:val="18"/>
+                <w:sz w:val="16"/>
               </w:rPr>
             </w:r>
           </w:p>
@@ -922,7 +886,7 @@
           <w:p>
             <w:r>
               <w:rPr>
-                <w:sz w:val="18"/>
+                <w:sz w:val="16"/>
               </w:rPr>
               <w:t>DPO</w:t>
             </w:r>
@@ -935,7 +899,7 @@
           <w:p>
             <w:r>
               <w:rPr>
-                <w:sz w:val="18"/>
+                <w:sz w:val="16"/>
               </w:rPr>
               <w:t>[À COMPLÉTER]</w:t>
             </w:r>
@@ -948,7 +912,7 @@
           <w:p>
             <w:r>
               <w:rPr>
-                <w:sz w:val="18"/>
+                <w:sz w:val="16"/>
               </w:rPr>
             </w:r>
           </w:p>
@@ -960,79 +924,13 @@
           <w:p>
             <w:r>
               <w:rPr>
-                <w:sz w:val="18"/>
-              </w:rPr>
-            </w:r>
-          </w:p>
-        </w:tc>
-      </w:tr>
-      <w:tr>
-        <w:tc>
-          <w:tcPr>
-            <w:tcW w:type="dxa" w:w="2160"/>
-          </w:tcPr>
-          <w:p>
-            <w:r>
-              <w:rPr>
-                <w:sz w:val="18"/>
-              </w:rPr>
-              <w:t>Avis des personnes concernées (le cas échéant)</w:t>
-            </w:r>
-          </w:p>
-        </w:tc>
-        <w:tc>
-          <w:tcPr>
-            <w:tcW w:type="dxa" w:w="2160"/>
-          </w:tcPr>
-          <w:p>
-            <w:r>
-              <w:rPr>
-                <w:sz w:val="18"/>
-              </w:rPr>
-              <w:t>[À COMPLÉTER]</w:t>
-            </w:r>
-          </w:p>
-        </w:tc>
-        <w:tc>
-          <w:tcPr>
-            <w:tcW w:type="dxa" w:w="2160"/>
-          </w:tcPr>
-          <w:p>
-            <w:r>
-              <w:rPr>
-                <w:sz w:val="18"/>
-              </w:rPr>
-            </w:r>
-          </w:p>
-        </w:tc>
-        <w:tc>
-          <w:tcPr>
-            <w:tcW w:type="dxa" w:w="2160"/>
-          </w:tcPr>
-          <w:p>
-            <w:r>
-              <w:rPr>
-                <w:sz w:val="18"/>
+                <w:sz w:val="16"/>
               </w:rPr>
             </w:r>
           </w:p>
         </w:tc>
       </w:tr>
     </w:tbl>
-    <w:p>
-      <w:pPr>
-        <w:spacing w:after="120"/>
-      </w:pPr>
-      <w:r>
-        <w:rPr>
-          <w:b w:val="0"/>
-          <w:i/>
-          <w:color w:val="475565"/>
-          <w:sz w:val="17"/>
-        </w:rPr>
-        <w:t>Cette AIPD est un document de travail à valider par le DPO. Elle ne constitue pas un avis juridique. Outil recommandé : logiciel PIA de la CNIL.</w:t>
-      </w:r>
-    </w:p>
     <w:sectPr>
       <w:pgSz w:w="12240" w:h="15840"/>
       <w:pgMar w:top="1440" w:right="1800" w:bottom="1440" w:left="1800" w:header="720" w:footer="720" w:gutter="0"/>

</xml_diff>